<commit_message>
feat: swap duty double-click mode with judge/staff constraint and purple blink UI
</commit_message>
<xml_diff>
--- a/uploads/template_docx/ven_jk_tm.docx
+++ b/uploads/template_docx/ven_jk_tm.docx
@@ -1,6 +1,6 @@
 
 <file path=word/document.xml><?xml version="1.0" encoding="utf-8"?>
-<w:document xmlns:wpc="http://schemas.microsoft.com/office/word/2010/wordprocessingCanvas" xmlns:cx="http://schemas.microsoft.com/office/drawing/2014/chartex" xmlns:cx1="http://schemas.microsoft.com/office/drawing/2015/9/8/chartex" xmlns:mc="http://schemas.openxmlformats.org/markup-compatibility/2006" xmlns:o="urn:schemas-microsoft-com:office:office" xmlns:r="http://schemas.openxmlformats.org/officeDocument/2006/relationships" xmlns:m="http://schemas.openxmlformats.org/officeDocument/2006/math" xmlns:v="urn:schemas-microsoft-com:vml" xmlns:wp14="http://schemas.microsoft.com/office/word/2010/wordprocessingDrawing" xmlns:wp="http://schemas.openxmlformats.org/drawingml/2006/wordprocessingDrawing" xmlns:w10="urn:schemas-microsoft-com:office:word" xmlns:w="http://schemas.openxmlformats.org/wordprocessingml/2006/main" xmlns:w14="http://schemas.microsoft.com/office/word/2010/wordml" xmlns:w15="http://schemas.microsoft.com/office/word/2012/wordml" xmlns:w16se="http://schemas.microsoft.com/office/word/2015/wordml/symex" xmlns:wpg="http://schemas.microsoft.com/office/word/2010/wordprocessingGroup" xmlns:wpi="http://schemas.microsoft.com/office/word/2010/wordprocessingInk" xmlns:wne="http://schemas.microsoft.com/office/word/2006/wordml" xmlns:wps="http://schemas.microsoft.com/office/word/2010/wordprocessingShape" mc:Ignorable="w14 w15 w16se wp14">
+<w:document xmlns:wpc="http://schemas.microsoft.com/office/word/2010/wordprocessingCanvas" xmlns:cx="http://schemas.microsoft.com/office/drawing/2014/chartex" xmlns:cx1="http://schemas.microsoft.com/office/drawing/2015/9/8/chartex" xmlns:cx2="http://schemas.microsoft.com/office/drawing/2015/10/21/chartex" xmlns:cx3="http://schemas.microsoft.com/office/drawing/2016/5/9/chartex" xmlns:cx4="http://schemas.microsoft.com/office/drawing/2016/5/10/chartex" xmlns:cx5="http://schemas.microsoft.com/office/drawing/2016/5/11/chartex" xmlns:cx6="http://schemas.microsoft.com/office/drawing/2016/5/12/chartex" xmlns:cx7="http://schemas.microsoft.com/office/drawing/2016/5/13/chartex" xmlns:cx8="http://schemas.microsoft.com/office/drawing/2016/5/14/chartex" xmlns:mc="http://schemas.openxmlformats.org/markup-compatibility/2006" xmlns:aink="http://schemas.microsoft.com/office/drawing/2016/ink" xmlns:am3d="http://schemas.microsoft.com/office/drawing/2017/model3d" xmlns:o="urn:schemas-microsoft-com:office:office" xmlns:oel="http://schemas.microsoft.com/office/2019/extlst" xmlns:r="http://schemas.openxmlformats.org/officeDocument/2006/relationships" xmlns:m="http://schemas.openxmlformats.org/officeDocument/2006/math" xmlns:v="urn:schemas-microsoft-com:vml" xmlns:wp14="http://schemas.microsoft.com/office/word/2010/wordprocessingDrawing" xmlns:wp="http://schemas.openxmlformats.org/drawingml/2006/wordprocessingDrawing" xmlns:w10="urn:schemas-microsoft-com:office:word" xmlns:w="http://schemas.openxmlformats.org/wordprocessingml/2006/main" xmlns:w14="http://schemas.microsoft.com/office/word/2010/wordml" xmlns:w15="http://schemas.microsoft.com/office/word/2012/wordml" xmlns:w16cex="http://schemas.microsoft.com/office/word/2018/wordml/cex" xmlns:w16cid="http://schemas.microsoft.com/office/word/2016/wordml/cid" xmlns:w16="http://schemas.microsoft.com/office/word/2018/wordml" xmlns:w16du="http://schemas.microsoft.com/office/word/2023/wordml/word16du" xmlns:w16sdtdh="http://schemas.microsoft.com/office/word/2020/wordml/sdtdatahash" xmlns:w16sdtfl="http://schemas.microsoft.com/office/word/2024/wordml/sdtformatlock" xmlns:w16se="http://schemas.microsoft.com/office/word/2015/wordml/symex" xmlns:wpg="http://schemas.microsoft.com/office/word/2010/wordprocessingGroup" xmlns:wpi="http://schemas.microsoft.com/office/word/2010/wordprocessingInk" xmlns:wne="http://schemas.microsoft.com/office/word/2006/wordml" xmlns:wps="http://schemas.microsoft.com/office/word/2010/wordprocessingShape" mc:Ignorable="w14 w15 w16se w16cid w16 w16cex w16sdtdh w16sdtfl w16du wp14">
   <w:body>
     <w:p>
       <w:pPr>
@@ -84,16 +84,45 @@
           <w:szCs w:val="34"/>
           <w:cs/>
         </w:rPr>
-        <w:t>ตามคำสั่งของศาลเย</w:t>
-      </w:r>
-      <w:r>
-        <w:rPr>
-          <w:rFonts w:ascii="TH SarabunIT๙" w:hAnsi="TH SarabunIT๙" w:cs="TH SarabunIT๙"/>
-          <w:sz w:val="34"/>
-          <w:szCs w:val="34"/>
-          <w:cs/>
-        </w:rPr>
-        <w:t xml:space="preserve">าวชนและครอบครัวจังหวัดสตูล ที่ </w:t>
+        <w:t>ตามคำสั่งของศาล</w:t>
+      </w:r>
+      <w:r>
+        <w:rPr>
+          <w:rFonts w:ascii="TH SarabunIT๙" w:hAnsi="TH SarabunIT๙" w:cs="TH SarabunIT๙"/>
+          <w:sz w:val="34"/>
+          <w:szCs w:val="34"/>
+          <w:cs/>
+        </w:rPr>
+        <w:t>จังหวัด</w:t>
+      </w:r>
+      <w:proofErr w:type="spellStart"/>
+      <w:r>
+        <w:rPr>
+          <w:rFonts w:ascii="TH SarabunIT๙" w:hAnsi="TH SarabunIT๙" w:cs="TH SarabunIT๙" w:hint="cs"/>
+          <w:sz w:val="34"/>
+          <w:szCs w:val="34"/>
+          <w:cs/>
+        </w:rPr>
+        <w:t>เบ</w:t>
+      </w:r>
+      <w:proofErr w:type="spellEnd"/>
+      <w:r>
+        <w:rPr>
+          <w:rFonts w:ascii="TH SarabunIT๙" w:hAnsi="TH SarabunIT๙" w:cs="TH SarabunIT๙" w:hint="cs"/>
+          <w:sz w:val="34"/>
+          <w:szCs w:val="34"/>
+          <w:cs/>
+        </w:rPr>
+        <w:t>ตง</w:t>
+      </w:r>
+      <w:r>
+        <w:rPr>
+          <w:rFonts w:ascii="TH SarabunIT๙" w:hAnsi="TH SarabunIT๙" w:cs="TH SarabunIT๙"/>
+          <w:sz w:val="34"/>
+          <w:szCs w:val="34"/>
+          <w:cs/>
+        </w:rPr>
+        <w:t xml:space="preserve"> ที่ </w:t>
       </w:r>
       <w:r>
         <w:rPr>
@@ -112,13 +141,23 @@
         </w:rPr>
         <w:t>${</w:t>
       </w:r>
-      <w:r>
-        <w:rPr>
-          <w:rFonts w:ascii="TH SarabunIT๙" w:hAnsi="TH SarabunIT๙" w:cs="TH SarabunIT๙"/>
-          <w:sz w:val="34"/>
-          <w:szCs w:val="34"/>
-        </w:rPr>
-        <w:t>ven_com_num}</w:t>
+      <w:proofErr w:type="spellStart"/>
+      <w:r>
+        <w:rPr>
+          <w:rFonts w:ascii="TH SarabunIT๙" w:hAnsi="TH SarabunIT๙" w:cs="TH SarabunIT๙"/>
+          <w:sz w:val="34"/>
+          <w:szCs w:val="34"/>
+        </w:rPr>
+        <w:t>ven_com_num</w:t>
+      </w:r>
+      <w:proofErr w:type="spellEnd"/>
+      <w:r>
+        <w:rPr>
+          <w:rFonts w:ascii="TH SarabunIT๙" w:hAnsi="TH SarabunIT๙" w:cs="TH SarabunIT๙"/>
+          <w:sz w:val="34"/>
+          <w:szCs w:val="34"/>
+        </w:rPr>
+        <w:t>}</w:t>
       </w:r>
       <w:r>
         <w:rPr>
@@ -162,7 +201,25 @@
           <w:sz w:val="34"/>
           <w:szCs w:val="34"/>
         </w:rPr>
-        <w:t>${ven_com_date}</w:t>
+        <w:t>${</w:t>
+      </w:r>
+      <w:proofErr w:type="spellStart"/>
+      <w:r>
+        <w:rPr>
+          <w:rFonts w:ascii="TH SarabunIT๙" w:hAnsi="TH SarabunIT๙" w:cs="TH SarabunIT๙"/>
+          <w:sz w:val="34"/>
+          <w:szCs w:val="34"/>
+        </w:rPr>
+        <w:t>ven_com_date</w:t>
+      </w:r>
+      <w:proofErr w:type="spellEnd"/>
+      <w:r>
+        <w:rPr>
+          <w:rFonts w:ascii="TH SarabunIT๙" w:hAnsi="TH SarabunIT๙" w:cs="TH SarabunIT๙"/>
+          <w:sz w:val="34"/>
+          <w:szCs w:val="34"/>
+        </w:rPr>
+        <w:t>}</w:t>
       </w:r>
       <w:r>
         <w:rPr>
@@ -307,6 +364,7 @@
         </w:rPr>
         <w:t>${</w:t>
       </w:r>
+      <w:proofErr w:type="spellStart"/>
       <w:r>
         <w:rPr>
           <w:rFonts w:ascii="TH SarabunIT๙" w:hAnsi="TH SarabunIT๙" w:cs="TH SarabunIT๙"/>
@@ -315,6 +373,7 @@
         </w:rPr>
         <w:t>ven_date_d</w:t>
       </w:r>
+      <w:proofErr w:type="spellEnd"/>
       <w:r>
         <w:rPr>
           <w:rFonts w:ascii="TH SarabunIT๙" w:hAnsi="TH SarabunIT๙" w:cs="TH SarabunIT๙"/>
@@ -383,7 +442,25 @@
           <w:sz w:val="34"/>
           <w:szCs w:val="34"/>
         </w:rPr>
-        <w:t>${ven_date_m}</w:t>
+        <w:t>${</w:t>
+      </w:r>
+      <w:proofErr w:type="spellStart"/>
+      <w:r>
+        <w:rPr>
+          <w:rFonts w:ascii="TH SarabunIT๙" w:hAnsi="TH SarabunIT๙" w:cs="TH SarabunIT๙"/>
+          <w:sz w:val="34"/>
+          <w:szCs w:val="34"/>
+        </w:rPr>
+        <w:t>ven_date_m</w:t>
+      </w:r>
+      <w:proofErr w:type="spellEnd"/>
+      <w:r>
+        <w:rPr>
+          <w:rFonts w:ascii="TH SarabunIT๙" w:hAnsi="TH SarabunIT๙" w:cs="TH SarabunIT๙"/>
+          <w:sz w:val="34"/>
+          <w:szCs w:val="34"/>
+        </w:rPr>
+        <w:t>}</w:t>
       </w:r>
       <w:r>
         <w:rPr>
@@ -472,27 +549,34 @@
           <w:sz w:val="34"/>
           <w:szCs w:val="34"/>
         </w:rPr>
-        <w:t>${ven_date_y}</w:t>
-      </w:r>
-      <w:r>
-        <w:rPr>
-          <w:rFonts w:ascii="TH SarabunIT๙" w:hAnsi="TH SarabunIT๙" w:cs="TH SarabunIT๙"/>
-          <w:sz w:val="34"/>
-          <w:szCs w:val="34"/>
-          <w:cs/>
-        </w:rPr>
-        <w:t>..</w:t>
-      </w:r>
-      <w:bookmarkStart w:id="0" w:name="_GoBack"/>
-      <w:bookmarkEnd w:id="0"/>
-      <w:r>
-        <w:rPr>
-          <w:rFonts w:ascii="TH SarabunIT๙" w:hAnsi="TH SarabunIT๙" w:cs="TH SarabunIT๙"/>
-          <w:sz w:val="34"/>
-          <w:szCs w:val="34"/>
-          <w:cs/>
-        </w:rPr>
-        <w:t>...... เวลา...</w:t>
+        <w:t>${</w:t>
+      </w:r>
+      <w:proofErr w:type="spellStart"/>
+      <w:r>
+        <w:rPr>
+          <w:rFonts w:ascii="TH SarabunIT๙" w:hAnsi="TH SarabunIT๙" w:cs="TH SarabunIT๙"/>
+          <w:sz w:val="34"/>
+          <w:szCs w:val="34"/>
+        </w:rPr>
+        <w:t>ven_date_y</w:t>
+      </w:r>
+      <w:proofErr w:type="spellEnd"/>
+      <w:r>
+        <w:rPr>
+          <w:rFonts w:ascii="TH SarabunIT๙" w:hAnsi="TH SarabunIT๙" w:cs="TH SarabunIT๙"/>
+          <w:sz w:val="34"/>
+          <w:szCs w:val="34"/>
+        </w:rPr>
+        <w:t>}</w:t>
+      </w:r>
+      <w:r>
+        <w:rPr>
+          <w:rFonts w:ascii="TH SarabunIT๙" w:hAnsi="TH SarabunIT๙" w:cs="TH SarabunIT๙"/>
+          <w:sz w:val="34"/>
+          <w:szCs w:val="34"/>
+          <w:cs/>
+        </w:rPr>
+        <w:t>........ เวลา...</w:t>
       </w:r>
       <w:r>
         <w:rPr>
@@ -586,6 +670,7 @@
         </w:rPr>
         <w:t>${</w:t>
       </w:r>
+      <w:proofErr w:type="spellStart"/>
       <w:r>
         <w:rPr>
           <w:rFonts w:ascii="TH SarabunIT๙" w:hAnsi="TH SarabunIT๙" w:cs="TH SarabunIT๙"/>
@@ -610,6 +695,7 @@
         </w:rPr>
         <w:t>d</w:t>
       </w:r>
+      <w:proofErr w:type="spellEnd"/>
       <w:r>
         <w:rPr>
           <w:rFonts w:ascii="TH SarabunIT๙" w:hAnsi="TH SarabunIT๙" w:cs="TH SarabunIT๙"/>
@@ -698,6 +784,7 @@
         </w:rPr>
         <w:t>${</w:t>
       </w:r>
+      <w:proofErr w:type="spellStart"/>
       <w:r>
         <w:rPr>
           <w:rFonts w:ascii="TH SarabunIT๙" w:hAnsi="TH SarabunIT๙" w:cs="TH SarabunIT๙"/>
@@ -712,7 +799,16 @@
           <w:sz w:val="34"/>
           <w:szCs w:val="34"/>
         </w:rPr>
-        <w:t>next_m}</w:t>
+        <w:t>next_m</w:t>
+      </w:r>
+      <w:proofErr w:type="spellEnd"/>
+      <w:r>
+        <w:rPr>
+          <w:rFonts w:ascii="TH SarabunIT๙" w:hAnsi="TH SarabunIT๙" w:cs="TH SarabunIT๙"/>
+          <w:sz w:val="34"/>
+          <w:szCs w:val="34"/>
+        </w:rPr>
+        <w:t>}</w:t>
       </w:r>
       <w:r>
         <w:rPr>
@@ -785,6 +881,7 @@
         </w:rPr>
         <w:t>${</w:t>
       </w:r>
+      <w:proofErr w:type="spellStart"/>
       <w:r>
         <w:rPr>
           <w:rFonts w:ascii="TH SarabunIT๙" w:hAnsi="TH SarabunIT๙" w:cs="TH SarabunIT๙"/>
@@ -799,7 +896,16 @@
           <w:sz w:val="34"/>
           <w:szCs w:val="34"/>
         </w:rPr>
-        <w:t>next_y}</w:t>
+        <w:t>next_y</w:t>
+      </w:r>
+      <w:proofErr w:type="spellEnd"/>
+      <w:r>
+        <w:rPr>
+          <w:rFonts w:ascii="TH SarabunIT๙" w:hAnsi="TH SarabunIT๙" w:cs="TH SarabunIT๙"/>
+          <w:sz w:val="34"/>
+          <w:szCs w:val="34"/>
+        </w:rPr>
+        <w:t>}</w:t>
       </w:r>
       <w:r>
         <w:rPr>
@@ -1422,7 +1528,27 @@
           <w:szCs w:val="34"/>
           <w:cs/>
         </w:rPr>
-        <w:t>ผู้พิพากษาหัวหน้าศาลเยาวชนและครอบครัวจังหวัดสตูล</w:t>
+        <w:t>ผู้พิพากษาหัวหน้าศาลจังหวัด</w:t>
+      </w:r>
+      <w:proofErr w:type="spellStart"/>
+      <w:r>
+        <w:rPr>
+          <w:rFonts w:ascii="TH SarabunIT๙" w:hAnsi="TH SarabunIT๙" w:cs="TH SarabunIT๙" w:hint="cs"/>
+          <w:sz w:val="34"/>
+          <w:szCs w:val="34"/>
+          <w:cs/>
+        </w:rPr>
+        <w:t>เบ</w:t>
+      </w:r>
+      <w:proofErr w:type="spellEnd"/>
+      <w:r>
+        <w:rPr>
+          <w:rFonts w:ascii="TH SarabunIT๙" w:hAnsi="TH SarabunIT๙" w:cs="TH SarabunIT๙" w:hint="cs"/>
+          <w:sz w:val="34"/>
+          <w:szCs w:val="34"/>
+          <w:cs/>
+        </w:rPr>
+        <w:t>ตง</w:t>
       </w:r>
     </w:p>
     <w:p>
@@ -1444,7 +1570,7 @@
         <mc:AlternateContent>
           <mc:Choice Requires="wps">
             <w:drawing>
-              <wp:anchor distT="0" distB="0" distL="114300" distR="114300" simplePos="0" relativeHeight="251665920" behindDoc="0" locked="0" layoutInCell="1" allowOverlap="1">
+              <wp:anchor distT="0" distB="0" distL="114300" distR="114300" simplePos="0" relativeHeight="251665920" behindDoc="0" locked="0" layoutInCell="1" allowOverlap="1" wp14:anchorId="44F93181" wp14:editId="26ECFFFA">
                 <wp:simplePos x="0" y="0"/>
                 <wp:positionH relativeFrom="column">
                   <wp:posOffset>1251585</wp:posOffset>
@@ -1527,7 +1653,7 @@
         <mc:AlternateContent>
           <mc:Choice Requires="wps">
             <w:drawing>
-              <wp:anchor distT="0" distB="0" distL="114300" distR="114300" simplePos="0" relativeHeight="251651584" behindDoc="0" locked="0" layoutInCell="1" allowOverlap="1">
+              <wp:anchor distT="0" distB="0" distL="114300" distR="114300" simplePos="0" relativeHeight="251651584" behindDoc="0" locked="0" layoutInCell="1" allowOverlap="1" wp14:anchorId="6D24D2B0" wp14:editId="38B3A4F8">
                 <wp:simplePos x="0" y="0"/>
                 <wp:positionH relativeFrom="column">
                   <wp:posOffset>3026410</wp:posOffset>
@@ -1669,7 +1795,7 @@
         <mc:AlternateContent>
           <mc:Choice Requires="wps">
             <w:drawing>
-              <wp:anchor distT="0" distB="0" distL="114300" distR="114300" simplePos="0" relativeHeight="251652608" behindDoc="0" locked="0" layoutInCell="1" allowOverlap="1">
+              <wp:anchor distT="0" distB="0" distL="114300" distR="114300" simplePos="0" relativeHeight="251652608" behindDoc="0" locked="0" layoutInCell="1" allowOverlap="1" wp14:anchorId="5ECCA1D2" wp14:editId="6B68EC6C">
                 <wp:simplePos x="0" y="0"/>
                 <wp:positionH relativeFrom="column">
                   <wp:posOffset>262890</wp:posOffset>
@@ -1748,7 +1874,7 @@
         <mc:AlternateContent>
           <mc:Choice Requires="wps">
             <w:drawing>
-              <wp:anchor distT="0" distB="0" distL="114300" distR="114300" simplePos="0" relativeHeight="251653632" behindDoc="0" locked="0" layoutInCell="1" allowOverlap="1">
+              <wp:anchor distT="0" distB="0" distL="114300" distR="114300" simplePos="0" relativeHeight="251653632" behindDoc="0" locked="0" layoutInCell="1" allowOverlap="1" wp14:anchorId="3342E418" wp14:editId="2835461C">
                 <wp:simplePos x="0" y="0"/>
                 <wp:positionH relativeFrom="column">
                   <wp:posOffset>3317240</wp:posOffset>
@@ -1945,7 +2071,7 @@
               <mc:AlternateContent>
                 <mc:Choice Requires="wps">
                   <w:drawing>
-                    <wp:anchor distT="0" distB="0" distL="114300" distR="114300" simplePos="0" relativeHeight="251655680" behindDoc="0" locked="0" layoutInCell="1" allowOverlap="1">
+                    <wp:anchor distT="0" distB="0" distL="114300" distR="114300" simplePos="0" relativeHeight="251655680" behindDoc="0" locked="0" layoutInCell="1" allowOverlap="1" wp14:anchorId="1ECF6E66" wp14:editId="16CB0ACF">
                       <wp:simplePos x="0" y="0"/>
                       <wp:positionH relativeFrom="column">
                         <wp:posOffset>4404360</wp:posOffset>
@@ -2024,7 +2150,7 @@
               <mc:AlternateContent>
                 <mc:Choice Requires="wps">
                   <w:drawing>
-                    <wp:anchor distT="0" distB="0" distL="114300" distR="114300" simplePos="0" relativeHeight="251656704" behindDoc="0" locked="0" layoutInCell="1" allowOverlap="1">
+                    <wp:anchor distT="0" distB="0" distL="114300" distR="114300" simplePos="0" relativeHeight="251656704" behindDoc="0" locked="0" layoutInCell="1" allowOverlap="1" wp14:anchorId="066A732E" wp14:editId="3CD1663B">
                       <wp:simplePos x="0" y="0"/>
                       <wp:positionH relativeFrom="column">
                         <wp:posOffset>5624195</wp:posOffset>
@@ -2103,7 +2229,7 @@
               <mc:AlternateContent>
                 <mc:Choice Requires="wps">
                   <w:drawing>
-                    <wp:anchor distT="0" distB="0" distL="114300" distR="114300" simplePos="0" relativeHeight="251654656" behindDoc="0" locked="0" layoutInCell="1" allowOverlap="1">
+                    <wp:anchor distT="0" distB="0" distL="114300" distR="114300" simplePos="0" relativeHeight="251654656" behindDoc="0" locked="0" layoutInCell="1" allowOverlap="1" wp14:anchorId="484BB9F4" wp14:editId="1C299B49">
                       <wp:simplePos x="0" y="0"/>
                       <wp:positionH relativeFrom="column">
                         <wp:posOffset>2700020</wp:posOffset>
@@ -2240,7 +2366,7 @@
               <mc:AlternateContent>
                 <mc:Choice Requires="wps">
                   <w:drawing>
-                    <wp:anchor distT="0" distB="0" distL="114300" distR="114300" simplePos="0" relativeHeight="251658752" behindDoc="0" locked="0" layoutInCell="1" allowOverlap="1">
+                    <wp:anchor distT="0" distB="0" distL="114300" distR="114300" simplePos="0" relativeHeight="251658752" behindDoc="0" locked="0" layoutInCell="1" allowOverlap="1" wp14:anchorId="03370A9A" wp14:editId="719E6991">
                       <wp:simplePos x="0" y="0"/>
                       <wp:positionH relativeFrom="column">
                         <wp:posOffset>4404360</wp:posOffset>
@@ -2328,7 +2454,7 @@
               <mc:AlternateContent>
                 <mc:Choice Requires="wps">
                   <w:drawing>
-                    <wp:anchor distT="0" distB="0" distL="114300" distR="114300" simplePos="0" relativeHeight="251659776" behindDoc="0" locked="0" layoutInCell="1" allowOverlap="1">
+                    <wp:anchor distT="0" distB="0" distL="114300" distR="114300" simplePos="0" relativeHeight="251659776" behindDoc="0" locked="0" layoutInCell="1" allowOverlap="1" wp14:anchorId="6544E5A6" wp14:editId="1F2AF988">
                       <wp:simplePos x="0" y="0"/>
                       <wp:positionH relativeFrom="column">
                         <wp:posOffset>5624195</wp:posOffset>
@@ -2407,7 +2533,7 @@
               <mc:AlternateContent>
                 <mc:Choice Requires="wps">
                   <w:drawing>
-                    <wp:anchor distT="0" distB="0" distL="114300" distR="114300" simplePos="0" relativeHeight="251657728" behindDoc="0" locked="0" layoutInCell="1" allowOverlap="1">
+                    <wp:anchor distT="0" distB="0" distL="114300" distR="114300" simplePos="0" relativeHeight="251657728" behindDoc="0" locked="0" layoutInCell="1" allowOverlap="1" wp14:anchorId="4EB3A348" wp14:editId="5C8BE8EE">
                       <wp:simplePos x="0" y="0"/>
                       <wp:positionH relativeFrom="column">
                         <wp:posOffset>2700020</wp:posOffset>
@@ -2526,7 +2652,7 @@
               <mc:AlternateContent>
                 <mc:Choice Requires="wps">
                   <w:drawing>
-                    <wp:anchor distT="0" distB="0" distL="114300" distR="114300" simplePos="0" relativeHeight="251661824" behindDoc="0" locked="0" layoutInCell="1" allowOverlap="1">
+                    <wp:anchor distT="0" distB="0" distL="114300" distR="114300" simplePos="0" relativeHeight="251661824" behindDoc="0" locked="0" layoutInCell="1" allowOverlap="1" wp14:anchorId="7E73E240" wp14:editId="3EBBB1C1">
                       <wp:simplePos x="0" y="0"/>
                       <wp:positionH relativeFrom="column">
                         <wp:posOffset>4682490</wp:posOffset>
@@ -2605,7 +2731,7 @@
               <mc:AlternateContent>
                 <mc:Choice Requires="wps">
                   <w:drawing>
-                    <wp:anchor distT="0" distB="0" distL="114300" distR="114300" simplePos="0" relativeHeight="251660800" behindDoc="0" locked="0" layoutInCell="1" allowOverlap="1">
+                    <wp:anchor distT="0" distB="0" distL="114300" distR="114300" simplePos="0" relativeHeight="251660800" behindDoc="0" locked="0" layoutInCell="1" allowOverlap="1" wp14:anchorId="419F005F" wp14:editId="0BDE0C64">
                       <wp:simplePos x="0" y="0"/>
                       <wp:positionH relativeFrom="column">
                         <wp:posOffset>2760980</wp:posOffset>
@@ -2684,7 +2810,7 @@
               <mc:AlternateContent>
                 <mc:Choice Requires="wps">
                   <w:drawing>
-                    <wp:anchor distT="0" distB="0" distL="114300" distR="114300" simplePos="0" relativeHeight="251662848" behindDoc="0" locked="0" layoutInCell="1" allowOverlap="1">
+                    <wp:anchor distT="0" distB="0" distL="114300" distR="114300" simplePos="0" relativeHeight="251662848" behindDoc="0" locked="0" layoutInCell="1" allowOverlap="1" wp14:anchorId="608DFD91" wp14:editId="42458814">
                       <wp:simplePos x="0" y="0"/>
                       <wp:positionH relativeFrom="column">
                         <wp:posOffset>5624195</wp:posOffset>
@@ -3065,7 +3191,7 @@
         <mc:AlternateContent>
           <mc:Choice Requires="wps">
             <w:drawing>
-              <wp:anchor distT="0" distB="0" distL="114300" distR="114300" simplePos="0" relativeHeight="251663872" behindDoc="0" locked="0" layoutInCell="1" allowOverlap="1">
+              <wp:anchor distT="0" distB="0" distL="114300" distR="114300" simplePos="0" relativeHeight="251663872" behindDoc="0" locked="0" layoutInCell="1" allowOverlap="1" wp14:anchorId="00825065" wp14:editId="2252E01A">
                 <wp:simplePos x="0" y="0"/>
                 <wp:positionH relativeFrom="column">
                   <wp:posOffset>1770380</wp:posOffset>
@@ -3275,7 +3401,7 @@
         <mc:AlternateContent>
           <mc:Choice Requires="wps">
             <w:drawing>
-              <wp:anchor distT="0" distB="0" distL="114300" distR="114300" simplePos="0" relativeHeight="251664896" behindDoc="0" locked="0" layoutInCell="1" allowOverlap="1">
+              <wp:anchor distT="0" distB="0" distL="114300" distR="114300" simplePos="0" relativeHeight="251664896" behindDoc="0" locked="0" layoutInCell="1" allowOverlap="1" wp14:anchorId="606BFBC5" wp14:editId="29A68DFF">
                 <wp:simplePos x="0" y="0"/>
                 <wp:positionH relativeFrom="column">
                   <wp:posOffset>1712595</wp:posOffset>
@@ -3462,7 +3588,7 @@
         <mc:AlternateContent>
           <mc:Choice Requires="wps">
             <w:drawing>
-              <wp:anchor distT="0" distB="0" distL="114300" distR="114300" simplePos="0" relativeHeight="251649536" behindDoc="0" locked="0" layoutInCell="1" allowOverlap="1">
+              <wp:anchor distT="0" distB="0" distL="114300" distR="114300" simplePos="0" relativeHeight="251649536" behindDoc="0" locked="0" layoutInCell="1" allowOverlap="1" wp14:anchorId="75A22E20" wp14:editId="69D06E32">
                 <wp:simplePos x="0" y="0"/>
                 <wp:positionH relativeFrom="column">
                   <wp:posOffset>-134620</wp:posOffset>
@@ -3629,7 +3755,7 @@
                                 <w:szCs w:val="34"/>
                                 <w:cs/>
                               </w:rPr>
-                              <w:t xml:space="preserve">    </w:t>
+                              <w:t xml:space="preserve">  </w:t>
                             </w:r>
                             <w:r>
                               <w:rPr>
@@ -3638,7 +3764,7 @@
                                 <w:szCs w:val="34"/>
                                 <w:cs/>
                               </w:rPr>
-                              <w:t>(นางสาว</w:t>
+                              <w:t>(</w:t>
                             </w:r>
                             <w:r>
                               <w:rPr>
@@ -3647,7 +3773,7 @@
                                 <w:szCs w:val="34"/>
                                 <w:cs/>
                               </w:rPr>
-                              <w:t>หทัยรัตน์ ด้วงนิ่ม</w:t>
+                              <w:t xml:space="preserve">                              </w:t>
                             </w:r>
                             <w:r>
                               <w:rPr>
@@ -3740,11 +3866,11 @@
           </mc:Choice>
           <mc:Fallback>
             <w:pict>
-              <v:shapetype id="_x0000_t202" coordsize="21600,21600" o:spt="202" path="m,l,21600r21600,l21600,xe">
+              <v:shapetype w14:anchorId="75A22E20" id="_x0000_t202" coordsize="21600,21600" o:spt="202" path="m,l,21600r21600,l21600,xe">
                 <v:stroke joinstyle="miter"/>
                 <v:path gradientshapeok="t" o:connecttype="rect"/>
               </v:shapetype>
-              <v:shape id="Text Box 24" o:spid="_x0000_s1026" type="#_x0000_t202" style="position:absolute;margin-left:-10.6pt;margin-top:12.75pt;width:226.6pt;height:177.25pt;z-index:251649536;visibility:visible;mso-wrap-style:square;mso-width-percent:0;mso-height-percent:0;mso-wrap-distance-left:9pt;mso-wrap-distance-top:0;mso-wrap-distance-right:9pt;mso-wrap-distance-bottom:0;mso-position-horizontal:absolute;mso-position-horizontal-relative:text;mso-position-vertical:absolute;mso-position-vertical-relative:text;mso-width-percent:0;mso-height-percent:0;mso-width-relative:page;mso-height-relative:page;v-text-anchor:top" o:gfxdata="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" stroked="f">
+              <v:shape id="Text Box 24" o:spid="_x0000_s1026" type="#_x0000_t202" style="position:absolute;margin-left:-10.6pt;margin-top:12.75pt;width:226.6pt;height:177.25pt;z-index:251649536;visibility:visible;mso-wrap-style:square;mso-width-percent:0;mso-height-percent:0;mso-wrap-distance-left:9pt;mso-wrap-distance-top:0;mso-wrap-distance-right:9pt;mso-wrap-distance-bottom:0;mso-position-horizontal:absolute;mso-position-horizontal-relative:text;mso-position-vertical:absolute;mso-position-vertical-relative:text;mso-width-percent:0;mso-height-percent:0;mso-width-relative:page;mso-height-relative:page;v-text-anchor:top" o:gfxdata="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" stroked="f">
                 <v:textbox>
                   <w:txbxContent>
                     <w:p>
@@ -3864,7 +3990,7 @@
                           <w:szCs w:val="34"/>
                           <w:cs/>
                         </w:rPr>
-                        <w:t xml:space="preserve">    </w:t>
+                        <w:t xml:space="preserve">  </w:t>
                       </w:r>
                       <w:r>
                         <w:rPr>
@@ -3873,7 +3999,7 @@
                           <w:szCs w:val="34"/>
                           <w:cs/>
                         </w:rPr>
-                        <w:t>(นางสาว</w:t>
+                        <w:t>(</w:t>
                       </w:r>
                       <w:r>
                         <w:rPr>
@@ -3882,7 +4008,7 @@
                           <w:szCs w:val="34"/>
                           <w:cs/>
                         </w:rPr>
-                        <w:t>หทัยรัตน์ ด้วงนิ่ม</w:t>
+                        <w:t xml:space="preserve">                              </w:t>
                       </w:r>
                       <w:r>
                         <w:rPr>
@@ -4009,7 +4135,7 @@
         <mc:AlternateContent>
           <mc:Choice Requires="wps">
             <w:drawing>
-              <wp:anchor distT="0" distB="0" distL="114300" distR="114300" simplePos="0" relativeHeight="251650560" behindDoc="1" locked="0" layoutInCell="1" allowOverlap="1">
+              <wp:anchor distT="0" distB="0" distL="114300" distR="114300" simplePos="0" relativeHeight="251650560" behindDoc="1" locked="0" layoutInCell="1" allowOverlap="1" wp14:anchorId="7C2055A4" wp14:editId="7F8280D7">
                 <wp:simplePos x="0" y="0"/>
                 <wp:positionH relativeFrom="column">
                   <wp:posOffset>2461260</wp:posOffset>
@@ -4141,7 +4267,25 @@
                                 <w:szCs w:val="34"/>
                                 <w:cs/>
                               </w:rPr>
-                              <w:t>(นายไพโรจน์  ไพมณี)</w:t>
+                              <w:t>(</w:t>
+                            </w:r>
+                            <w:r>
+                              <w:rPr>
+                                <w:rFonts w:ascii="TH SarabunIT๙" w:hAnsi="TH SarabunIT๙" w:cs="TH SarabunIT๙" w:hint="cs"/>
+                                <w:sz w:val="34"/>
+                                <w:szCs w:val="34"/>
+                                <w:cs/>
+                              </w:rPr>
+                              <w:t xml:space="preserve">                                  </w:t>
+                            </w:r>
+                            <w:r>
+                              <w:rPr>
+                                <w:rFonts w:ascii="TH SarabunIT๙" w:hAnsi="TH SarabunIT๙" w:cs="TH SarabunIT๙"/>
+                                <w:sz w:val="34"/>
+                                <w:szCs w:val="34"/>
+                                <w:cs/>
+                              </w:rPr>
+                              <w:t>)</w:t>
                             </w:r>
                           </w:p>
                           <w:p>
@@ -4161,7 +4305,27 @@
                                 <w:szCs w:val="34"/>
                                 <w:cs/>
                               </w:rPr>
-                              <w:t>ผู้พิพากษาหัวหน้าศาลเยาวชนและครอบครัวจังหวัดสตูล</w:t>
+                              <w:t>ผู้พิพากษาหัวหน้าศาลจังหวัด</w:t>
+                            </w:r>
+                            <w:proofErr w:type="spellStart"/>
+                            <w:r>
+                              <w:rPr>
+                                <w:rFonts w:ascii="TH SarabunIT๙" w:hAnsi="TH SarabunIT๙" w:cs="TH SarabunIT๙" w:hint="cs"/>
+                                <w:sz w:val="34"/>
+                                <w:szCs w:val="34"/>
+                                <w:cs/>
+                              </w:rPr>
+                              <w:t>เบ</w:t>
+                            </w:r>
+                            <w:proofErr w:type="spellEnd"/>
+                            <w:r>
+                              <w:rPr>
+                                <w:rFonts w:ascii="TH SarabunIT๙" w:hAnsi="TH SarabunIT๙" w:cs="TH SarabunIT๙" w:hint="cs"/>
+                                <w:sz w:val="34"/>
+                                <w:szCs w:val="34"/>
+                                <w:cs/>
+                              </w:rPr>
+                              <w:t>ตง</w:t>
                             </w:r>
                           </w:p>
                           <w:p>
@@ -4205,7 +4369,7 @@
           </mc:Choice>
           <mc:Fallback>
             <w:pict>
-              <v:shape id="Text Box 26" o:spid="_x0000_s1027" type="#_x0000_t202" style="position:absolute;margin-left:193.8pt;margin-top:14.85pt;width:289.05pt;height:131.35pt;z-index:-251665920;visibility:visible;mso-wrap-style:square;mso-width-percent:0;mso-height-percent:0;mso-wrap-distance-left:9pt;mso-wrap-distance-top:0;mso-wrap-distance-right:9pt;mso-wrap-distance-bottom:0;mso-position-horizontal:absolute;mso-position-horizontal-relative:text;mso-position-vertical:absolute;mso-position-vertical-relative:text;mso-width-percent:0;mso-height-percent:0;mso-width-relative:page;mso-height-relative:page;v-text-anchor:top" o:gfxdata="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" stroked="f">
+              <v:shape w14:anchorId="7C2055A4" id="Text Box 26" o:spid="_x0000_s1027" type="#_x0000_t202" style="position:absolute;margin-left:193.8pt;margin-top:14.85pt;width:289.05pt;height:131.35pt;z-index:-251665920;visibility:visible;mso-wrap-style:square;mso-width-percent:0;mso-height-percent:0;mso-wrap-distance-left:9pt;mso-wrap-distance-top:0;mso-wrap-distance-right:9pt;mso-wrap-distance-bottom:0;mso-position-horizontal:absolute;mso-position-horizontal-relative:text;mso-position-vertical:absolute;mso-position-vertical-relative:text;mso-width-percent:0;mso-height-percent:0;mso-width-relative:page;mso-height-relative:page;v-text-anchor:top" o:gfxdata="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" stroked="f">
                 <v:textbox>
                   <w:txbxContent>
                     <w:p>
@@ -4290,7 +4454,25 @@
                           <w:szCs w:val="34"/>
                           <w:cs/>
                         </w:rPr>
-                        <w:t>(นายไพโรจน์  ไพมณี)</w:t>
+                        <w:t>(</w:t>
+                      </w:r>
+                      <w:r>
+                        <w:rPr>
+                          <w:rFonts w:ascii="TH SarabunIT๙" w:hAnsi="TH SarabunIT๙" w:cs="TH SarabunIT๙" w:hint="cs"/>
+                          <w:sz w:val="34"/>
+                          <w:szCs w:val="34"/>
+                          <w:cs/>
+                        </w:rPr>
+                        <w:t xml:space="preserve">                                  </w:t>
+                      </w:r>
+                      <w:r>
+                        <w:rPr>
+                          <w:rFonts w:ascii="TH SarabunIT๙" w:hAnsi="TH SarabunIT๙" w:cs="TH SarabunIT๙"/>
+                          <w:sz w:val="34"/>
+                          <w:szCs w:val="34"/>
+                          <w:cs/>
+                        </w:rPr>
+                        <w:t>)</w:t>
                       </w:r>
                     </w:p>
                     <w:p>
@@ -4310,7 +4492,27 @@
                           <w:szCs w:val="34"/>
                           <w:cs/>
                         </w:rPr>
-                        <w:t>ผู้พิพากษาหัวหน้าศาลเยาวชนและครอบครัวจังหวัดสตูล</w:t>
+                        <w:t>ผู้พิพากษาหัวหน้าศาลจังหวัด</w:t>
+                      </w:r>
+                      <w:proofErr w:type="spellStart"/>
+                      <w:r>
+                        <w:rPr>
+                          <w:rFonts w:ascii="TH SarabunIT๙" w:hAnsi="TH SarabunIT๙" w:cs="TH SarabunIT๙" w:hint="cs"/>
+                          <w:sz w:val="34"/>
+                          <w:szCs w:val="34"/>
+                          <w:cs/>
+                        </w:rPr>
+                        <w:t>เบ</w:t>
+                      </w:r>
+                      <w:proofErr w:type="spellEnd"/>
+                      <w:r>
+                        <w:rPr>
+                          <w:rFonts w:ascii="TH SarabunIT๙" w:hAnsi="TH SarabunIT๙" w:cs="TH SarabunIT๙" w:hint="cs"/>
+                          <w:sz w:val="34"/>
+                          <w:szCs w:val="34"/>
+                          <w:cs/>
+                        </w:rPr>
+                        <w:t>ตง</w:t>
                       </w:r>
                     </w:p>
                     <w:p>
@@ -4467,7 +4669,7 @@
 </file>
 
 <file path=word/endnotes.xml><?xml version="1.0" encoding="utf-8"?>
-<w:endnotes xmlns:wpc="http://schemas.microsoft.com/office/word/2010/wordprocessingCanvas" xmlns:cx="http://schemas.microsoft.com/office/drawing/2014/chartex" xmlns:cx1="http://schemas.microsoft.com/office/drawing/2015/9/8/chartex" xmlns:mc="http://schemas.openxmlformats.org/markup-compatibility/2006" xmlns:o="urn:schemas-microsoft-com:office:office" xmlns:r="http://schemas.openxmlformats.org/officeDocument/2006/relationships" xmlns:m="http://schemas.openxmlformats.org/officeDocument/2006/math" xmlns:v="urn:schemas-microsoft-com:vml" xmlns:wp14="http://schemas.microsoft.com/office/word/2010/wordprocessingDrawing" xmlns:wp="http://schemas.openxmlformats.org/drawingml/2006/wordprocessingDrawing" xmlns:w10="urn:schemas-microsoft-com:office:word" xmlns:w="http://schemas.openxmlformats.org/wordprocessingml/2006/main" xmlns:w14="http://schemas.microsoft.com/office/word/2010/wordml" xmlns:w15="http://schemas.microsoft.com/office/word/2012/wordml" xmlns:w16se="http://schemas.microsoft.com/office/word/2015/wordml/symex" xmlns:wpg="http://schemas.microsoft.com/office/word/2010/wordprocessingGroup" xmlns:wpi="http://schemas.microsoft.com/office/word/2010/wordprocessingInk" xmlns:wne="http://schemas.microsoft.com/office/word/2006/wordml" xmlns:wps="http://schemas.microsoft.com/office/word/2010/wordprocessingShape" mc:Ignorable="w14 w15 w16se wp14">
+<w:endnotes xmlns:wpc="http://schemas.microsoft.com/office/word/2010/wordprocessingCanvas" xmlns:cx="http://schemas.microsoft.com/office/drawing/2014/chartex" xmlns:cx1="http://schemas.microsoft.com/office/drawing/2015/9/8/chartex" xmlns:cx2="http://schemas.microsoft.com/office/drawing/2015/10/21/chartex" xmlns:cx3="http://schemas.microsoft.com/office/drawing/2016/5/9/chartex" xmlns:cx4="http://schemas.microsoft.com/office/drawing/2016/5/10/chartex" xmlns:cx5="http://schemas.microsoft.com/office/drawing/2016/5/11/chartex" xmlns:cx6="http://schemas.microsoft.com/office/drawing/2016/5/12/chartex" xmlns:cx7="http://schemas.microsoft.com/office/drawing/2016/5/13/chartex" xmlns:cx8="http://schemas.microsoft.com/office/drawing/2016/5/14/chartex" xmlns:mc="http://schemas.openxmlformats.org/markup-compatibility/2006" xmlns:aink="http://schemas.microsoft.com/office/drawing/2016/ink" xmlns:am3d="http://schemas.microsoft.com/office/drawing/2017/model3d" xmlns:o="urn:schemas-microsoft-com:office:office" xmlns:oel="http://schemas.microsoft.com/office/2019/extlst" xmlns:r="http://schemas.openxmlformats.org/officeDocument/2006/relationships" xmlns:m="http://schemas.openxmlformats.org/officeDocument/2006/math" xmlns:v="urn:schemas-microsoft-com:vml" xmlns:wp14="http://schemas.microsoft.com/office/word/2010/wordprocessingDrawing" xmlns:wp="http://schemas.openxmlformats.org/drawingml/2006/wordprocessingDrawing" xmlns:w10="urn:schemas-microsoft-com:office:word" xmlns:w="http://schemas.openxmlformats.org/wordprocessingml/2006/main" xmlns:w14="http://schemas.microsoft.com/office/word/2010/wordml" xmlns:w15="http://schemas.microsoft.com/office/word/2012/wordml" xmlns:w16cex="http://schemas.microsoft.com/office/word/2018/wordml/cex" xmlns:w16cid="http://schemas.microsoft.com/office/word/2016/wordml/cid" xmlns:w16="http://schemas.microsoft.com/office/word/2018/wordml" xmlns:w16du="http://schemas.microsoft.com/office/word/2023/wordml/word16du" xmlns:w16sdtdh="http://schemas.microsoft.com/office/word/2020/wordml/sdtdatahash" xmlns:w16sdtfl="http://schemas.microsoft.com/office/word/2024/wordml/sdtformatlock" xmlns:w16se="http://schemas.microsoft.com/office/word/2015/wordml/symex" xmlns:wpg="http://schemas.microsoft.com/office/word/2010/wordprocessingGroup" xmlns:wpi="http://schemas.microsoft.com/office/word/2010/wordprocessingInk" xmlns:wne="http://schemas.microsoft.com/office/word/2006/wordml" xmlns:wps="http://schemas.microsoft.com/office/word/2010/wordprocessingShape" mc:Ignorable="w14 w15 w16se w16cid w16 w16cex w16sdtdh w16sdtfl w16du wp14">
   <w:endnote w:type="separator" w:id="-1">
     <w:p>
       <w:r>
@@ -4486,7 +4688,7 @@
 </file>
 
 <file path=word/footnotes.xml><?xml version="1.0" encoding="utf-8"?>
-<w:footnotes xmlns:wpc="http://schemas.microsoft.com/office/word/2010/wordprocessingCanvas" xmlns:cx="http://schemas.microsoft.com/office/drawing/2014/chartex" xmlns:cx1="http://schemas.microsoft.com/office/drawing/2015/9/8/chartex" xmlns:mc="http://schemas.openxmlformats.org/markup-compatibility/2006" xmlns:o="urn:schemas-microsoft-com:office:office" xmlns:r="http://schemas.openxmlformats.org/officeDocument/2006/relationships" xmlns:m="http://schemas.openxmlformats.org/officeDocument/2006/math" xmlns:v="urn:schemas-microsoft-com:vml" xmlns:wp14="http://schemas.microsoft.com/office/word/2010/wordprocessingDrawing" xmlns:wp="http://schemas.openxmlformats.org/drawingml/2006/wordprocessingDrawing" xmlns:w10="urn:schemas-microsoft-com:office:word" xmlns:w="http://schemas.openxmlformats.org/wordprocessingml/2006/main" xmlns:w14="http://schemas.microsoft.com/office/word/2010/wordml" xmlns:w15="http://schemas.microsoft.com/office/word/2012/wordml" xmlns:w16se="http://schemas.microsoft.com/office/word/2015/wordml/symex" xmlns:wpg="http://schemas.microsoft.com/office/word/2010/wordprocessingGroup" xmlns:wpi="http://schemas.microsoft.com/office/word/2010/wordprocessingInk" xmlns:wne="http://schemas.microsoft.com/office/word/2006/wordml" xmlns:wps="http://schemas.microsoft.com/office/word/2010/wordprocessingShape" mc:Ignorable="w14 w15 w16se wp14">
+<w:footnotes xmlns:wpc="http://schemas.microsoft.com/office/word/2010/wordprocessingCanvas" xmlns:cx="http://schemas.microsoft.com/office/drawing/2014/chartex" xmlns:cx1="http://schemas.microsoft.com/office/drawing/2015/9/8/chartex" xmlns:cx2="http://schemas.microsoft.com/office/drawing/2015/10/21/chartex" xmlns:cx3="http://schemas.microsoft.com/office/drawing/2016/5/9/chartex" xmlns:cx4="http://schemas.microsoft.com/office/drawing/2016/5/10/chartex" xmlns:cx5="http://schemas.microsoft.com/office/drawing/2016/5/11/chartex" xmlns:cx6="http://schemas.microsoft.com/office/drawing/2016/5/12/chartex" xmlns:cx7="http://schemas.microsoft.com/office/drawing/2016/5/13/chartex" xmlns:cx8="http://schemas.microsoft.com/office/drawing/2016/5/14/chartex" xmlns:mc="http://schemas.openxmlformats.org/markup-compatibility/2006" xmlns:aink="http://schemas.microsoft.com/office/drawing/2016/ink" xmlns:am3d="http://schemas.microsoft.com/office/drawing/2017/model3d" xmlns:o="urn:schemas-microsoft-com:office:office" xmlns:oel="http://schemas.microsoft.com/office/2019/extlst" xmlns:r="http://schemas.openxmlformats.org/officeDocument/2006/relationships" xmlns:m="http://schemas.openxmlformats.org/officeDocument/2006/math" xmlns:v="urn:schemas-microsoft-com:vml" xmlns:wp14="http://schemas.microsoft.com/office/word/2010/wordprocessingDrawing" xmlns:wp="http://schemas.openxmlformats.org/drawingml/2006/wordprocessingDrawing" xmlns:w10="urn:schemas-microsoft-com:office:word" xmlns:w="http://schemas.openxmlformats.org/wordprocessingml/2006/main" xmlns:w14="http://schemas.microsoft.com/office/word/2010/wordml" xmlns:w15="http://schemas.microsoft.com/office/word/2012/wordml" xmlns:w16cex="http://schemas.microsoft.com/office/word/2018/wordml/cex" xmlns:w16cid="http://schemas.microsoft.com/office/word/2016/wordml/cid" xmlns:w16="http://schemas.microsoft.com/office/word/2018/wordml" xmlns:w16du="http://schemas.microsoft.com/office/word/2023/wordml/word16du" xmlns:w16sdtdh="http://schemas.microsoft.com/office/word/2020/wordml/sdtdatahash" xmlns:w16sdtfl="http://schemas.microsoft.com/office/word/2024/wordml/sdtformatlock" xmlns:w16se="http://schemas.microsoft.com/office/word/2015/wordml/symex" xmlns:wpg="http://schemas.microsoft.com/office/word/2010/wordprocessingGroup" xmlns:wpi="http://schemas.microsoft.com/office/word/2010/wordprocessingInk" xmlns:wne="http://schemas.microsoft.com/office/word/2006/wordml" xmlns:wps="http://schemas.microsoft.com/office/word/2010/wordprocessingShape" mc:Ignorable="w14 w15 w16se w16cid w16 w16cex w16sdtdh w16sdtfl w16du wp14">
   <w:footnote w:type="separator" w:id="-1">
     <w:p>
       <w:r>
@@ -4505,7 +4707,7 @@
 </file>
 
 <file path=word/numbering.xml><?xml version="1.0" encoding="utf-8"?>
-<w:numbering xmlns:wpc="http://schemas.microsoft.com/office/word/2010/wordprocessingCanvas" xmlns:cx="http://schemas.microsoft.com/office/drawing/2014/chartex" xmlns:cx1="http://schemas.microsoft.com/office/drawing/2015/9/8/chartex" xmlns:mc="http://schemas.openxmlformats.org/markup-compatibility/2006" xmlns:o="urn:schemas-microsoft-com:office:office" xmlns:r="http://schemas.openxmlformats.org/officeDocument/2006/relationships" xmlns:m="http://schemas.openxmlformats.org/officeDocument/2006/math" xmlns:v="urn:schemas-microsoft-com:vml" xmlns:wp14="http://schemas.microsoft.com/office/word/2010/wordprocessingDrawing" xmlns:wp="http://schemas.openxmlformats.org/drawingml/2006/wordprocessingDrawing" xmlns:w10="urn:schemas-microsoft-com:office:word" xmlns:w="http://schemas.openxmlformats.org/wordprocessingml/2006/main" xmlns:w14="http://schemas.microsoft.com/office/word/2010/wordml" xmlns:w15="http://schemas.microsoft.com/office/word/2012/wordml" xmlns:w16se="http://schemas.microsoft.com/office/word/2015/wordml/symex" xmlns:wpg="http://schemas.microsoft.com/office/word/2010/wordprocessingGroup" xmlns:wpi="http://schemas.microsoft.com/office/word/2010/wordprocessingInk" xmlns:wne="http://schemas.microsoft.com/office/word/2006/wordml" xmlns:wps="http://schemas.microsoft.com/office/word/2010/wordprocessingShape" mc:Ignorable="w14 w15 w16se wp14">
+<w:numbering xmlns:wpc="http://schemas.microsoft.com/office/word/2010/wordprocessingCanvas" xmlns:cx="http://schemas.microsoft.com/office/drawing/2014/chartex" xmlns:cx1="http://schemas.microsoft.com/office/drawing/2015/9/8/chartex" xmlns:cx2="http://schemas.microsoft.com/office/drawing/2015/10/21/chartex" xmlns:cx3="http://schemas.microsoft.com/office/drawing/2016/5/9/chartex" xmlns:cx4="http://schemas.microsoft.com/office/drawing/2016/5/10/chartex" xmlns:cx5="http://schemas.microsoft.com/office/drawing/2016/5/11/chartex" xmlns:cx6="http://schemas.microsoft.com/office/drawing/2016/5/12/chartex" xmlns:cx7="http://schemas.microsoft.com/office/drawing/2016/5/13/chartex" xmlns:cx8="http://schemas.microsoft.com/office/drawing/2016/5/14/chartex" xmlns:mc="http://schemas.openxmlformats.org/markup-compatibility/2006" xmlns:aink="http://schemas.microsoft.com/office/drawing/2016/ink" xmlns:am3d="http://schemas.microsoft.com/office/drawing/2017/model3d" xmlns:o="urn:schemas-microsoft-com:office:office" xmlns:oel="http://schemas.microsoft.com/office/2019/extlst" xmlns:r="http://schemas.openxmlformats.org/officeDocument/2006/relationships" xmlns:m="http://schemas.openxmlformats.org/officeDocument/2006/math" xmlns:v="urn:schemas-microsoft-com:vml" xmlns:wp14="http://schemas.microsoft.com/office/word/2010/wordprocessingDrawing" xmlns:wp="http://schemas.openxmlformats.org/drawingml/2006/wordprocessingDrawing" xmlns:w10="urn:schemas-microsoft-com:office:word" xmlns:w="http://schemas.openxmlformats.org/wordprocessingml/2006/main" xmlns:w14="http://schemas.microsoft.com/office/word/2010/wordml" xmlns:w15="http://schemas.microsoft.com/office/word/2012/wordml" xmlns:w16cex="http://schemas.microsoft.com/office/word/2018/wordml/cex" xmlns:w16cid="http://schemas.microsoft.com/office/word/2016/wordml/cid" xmlns:w16="http://schemas.microsoft.com/office/word/2018/wordml" xmlns:w16du="http://schemas.microsoft.com/office/word/2023/wordml/word16du" xmlns:w16sdtdh="http://schemas.microsoft.com/office/word/2020/wordml/sdtdatahash" xmlns:w16sdtfl="http://schemas.microsoft.com/office/word/2024/wordml/sdtformatlock" xmlns:w16se="http://schemas.microsoft.com/office/word/2015/wordml/symex" xmlns:wpg="http://schemas.microsoft.com/office/word/2010/wordprocessingGroup" xmlns:wpi="http://schemas.microsoft.com/office/word/2010/wordprocessingInk" xmlns:wne="http://schemas.microsoft.com/office/word/2006/wordml" xmlns:wps="http://schemas.microsoft.com/office/word/2010/wordprocessingShape" mc:Ignorable="w14 w15 w16se w16cid w16 w16cex w16sdtdh w16sdtfl w16du wp14">
   <w:abstractNum w:abstractNumId="0" w15:restartNumberingAfterBreak="0">
     <w:nsid w:val="037F436A"/>
     <w:multiLevelType w:val="hybridMultilevel"/>
@@ -4786,17 +4988,17 @@
       </w:rPr>
     </w:lvl>
   </w:abstractNum>
-  <w:num w:numId="1">
+  <w:num w:numId="1" w16cid:durableId="1804155838">
     <w:abstractNumId w:val="1"/>
   </w:num>
-  <w:num w:numId="2">
+  <w:num w:numId="2" w16cid:durableId="160123721">
     <w:abstractNumId w:val="0"/>
   </w:num>
 </w:numbering>
 </file>
 
 <file path=word/styles.xml><?xml version="1.0" encoding="utf-8"?>
-<w:styles xmlns:mc="http://schemas.openxmlformats.org/markup-compatibility/2006" xmlns:r="http://schemas.openxmlformats.org/officeDocument/2006/relationships" xmlns:w="http://schemas.openxmlformats.org/wordprocessingml/2006/main" xmlns:w14="http://schemas.microsoft.com/office/word/2010/wordml" xmlns:w15="http://schemas.microsoft.com/office/word/2012/wordml" xmlns:w16se="http://schemas.microsoft.com/office/word/2015/wordml/symex" mc:Ignorable="w14 w15 w16se">
+<w:styles xmlns:mc="http://schemas.openxmlformats.org/markup-compatibility/2006" xmlns:r="http://schemas.openxmlformats.org/officeDocument/2006/relationships" xmlns:w="http://schemas.openxmlformats.org/wordprocessingml/2006/main" xmlns:w14="http://schemas.microsoft.com/office/word/2010/wordml" xmlns:w15="http://schemas.microsoft.com/office/word/2012/wordml" xmlns:w16cex="http://schemas.microsoft.com/office/word/2018/wordml/cex" xmlns:w16cid="http://schemas.microsoft.com/office/word/2016/wordml/cid" xmlns:w16="http://schemas.microsoft.com/office/word/2018/wordml" xmlns:w16du="http://schemas.microsoft.com/office/word/2023/wordml/word16du" xmlns:w16sdtdh="http://schemas.microsoft.com/office/word/2020/wordml/sdtdatahash" xmlns:w16sdtfl="http://schemas.microsoft.com/office/word/2024/wordml/sdtformatlock" xmlns:w16se="http://schemas.microsoft.com/office/word/2015/wordml/symex" mc:Ignorable="w14 w15 w16se w16cid w16 w16cex w16sdtdh w16sdtfl w16du">
   <w:docDefaults>
     <w:rPrDefault>
       <w:rPr>
@@ -4806,7 +5008,7 @@
     </w:rPrDefault>
     <w:pPrDefault/>
   </w:docDefaults>
-  <w:latentStyles w:defLockedState="0" w:defUIPriority="0" w:defSemiHidden="0" w:defUnhideWhenUsed="0" w:defQFormat="0" w:count="371">
+  <w:latentStyles w:defLockedState="0" w:defUIPriority="0" w:defSemiHidden="0" w:defUnhideWhenUsed="0" w:defQFormat="0" w:count="376">
     <w:lsdException w:name="Normal" w:qFormat="1"/>
     <w:lsdException w:name="heading 1" w:qFormat="1"/>
     <w:lsdException w:name="heading 2" w:semiHidden="1" w:unhideWhenUsed="1" w:qFormat="1"/>
@@ -5081,6 +5283,11 @@
     <w:lsdException w:name="List Table 5 Dark Accent 6" w:uiPriority="50"/>
     <w:lsdException w:name="List Table 6 Colorful Accent 6" w:uiPriority="51"/>
     <w:lsdException w:name="List Table 7 Colorful Accent 6" w:uiPriority="52"/>
+    <w:lsdException w:name="Mention" w:semiHidden="1" w:uiPriority="99" w:unhideWhenUsed="1"/>
+    <w:lsdException w:name="Smart Hyperlink" w:semiHidden="1" w:uiPriority="99" w:unhideWhenUsed="1"/>
+    <w:lsdException w:name="Hashtag" w:semiHidden="1" w:uiPriority="99" w:unhideWhenUsed="1"/>
+    <w:lsdException w:name="Unresolved Mention" w:semiHidden="1" w:uiPriority="99" w:unhideWhenUsed="1"/>
+    <w:lsdException w:name="Smart Link" w:semiHidden="1" w:uiPriority="99" w:unhideWhenUsed="1"/>
   </w:latentStyles>
   <w:style w:type="paragraph" w:default="1" w:styleId="a">
     <w:name w:val="Normal"/>

</xml_diff>